<commit_message>
Upload “src/content/bios/La Guardia-FRH 2026.docx”
</commit_message>
<xml_diff>
--- a/src/content/bios/La Guardia-FRH 2026.docx
+++ b/src/content/bios/La Guardia-FRH 2026.docx
@@ -5211,12 +5211,16 @@
         <w:jc w:val="both"/>
         <w:rPr>
           <w:rFonts w:ascii="Times New Roman" w:hAnsi="Times New Roman" w:cs="Times New Roman"/>
+          <w:b/>
+          <w:bCs/>
           <w:lang w:val="en-GB"/>
         </w:rPr>
       </w:pPr>
       <w:r>
         <w:rPr>
           <w:rFonts w:ascii="Times New Roman" w:hAnsi="Times New Roman" w:cs="Times New Roman"/>
+          <w:b/>
+          <w:bCs/>
           <w:lang w:val="en-GB"/>
         </w:rPr>
         <w:t>Chloé Maurel</w:t>

</xml_diff>